<commit_message>
Add confirmed support metrics to Google gUP resume
Add resolution rate (80-90%, human parity), deployment volume (~9M calls/yr
Korea+Japan, 4-5K concurrent), and automated QA release gate as a dedicated
bullet; move parity claim out of the ownership bullet and into the summary
with the concrete rate.

Co-Authored-By: Claude Fable 5 <noreply@anthropic.com>
Claude-Session: https://claude.ai/code/session_01BTjwUKjDtPemEmzkEnKVEa
</commit_message>
<xml_diff>
--- a/Job Applications/Google - PM Conversational AI for Support gUP/Ethan_Sukhyun_Hong_PM_Google_ConvAI_Support.docx
+++ b/Job Applications/Google - PM Conversational AI for Support gUP/Ethan_Sukhyun_Hong_PM_Google_ConvAI_Support.docx
@@ -38,7 +38,7 @@
         <w:spacing w:after="40"/>
         <w:jc w:val="center"/>
       </w:pPr>
-      <w:hyperlink w:history="1" r:id="rIdn7kipiigpwlp7udalje5e">
+      <w:hyperlink w:history="1" r:id="rIdju6pksm_bwz1pcdiyio0b">
         <w:r>
           <w:rPr>
             <w:rFonts w:ascii="Calibri" w:cs="Calibri" w:eastAsia="Calibri" w:hAnsi="Calibri"/>
@@ -58,7 +58,7 @@
         </w:rPr>
         <w:t xml:space="preserve">  |  </w:t>
       </w:r>
-      <w:hyperlink w:history="1" r:id="rIdv83nx-eqvvwfstijrpamp">
+      <w:hyperlink w:history="1" r:id="rIdqkltwfgqma4l4yhkfxgko">
         <w:r>
           <w:rPr>
             <w:rFonts w:ascii="Calibri" w:cs="Calibri" w:eastAsia="Calibri" w:hAnsi="Calibri"/>
@@ -116,7 +116,7 @@
           <w:sz w:val="20"/>
           <w:szCs w:val="20"/>
         </w:rPr>
-        <w:t xml:space="preserve">AI Product Manager with 6+ years across product management, data science, and analytics, currently building Sendbird's customer-support AI agent product (Delight.ai) from 0→1 — generative conversational AI that resolves support conversations end-to-end at quality on par with human agents. Shipped production speech-to-speech LLM experiences, multi-agent orchestration across support channels, and pricing for enterprise SaaS. Deep hands-on background in Generative AI / LLM workflows, A/B testing, experimentation, and taking technical products from conception to launch.</w:t>
+        <w:t xml:space="preserve">AI Product Manager with 6+ years across product management, data science, and analytics, currently building Sendbird's customer-support AI agent product (Delight.ai) from 0→1 — generative conversational AI resolving 80–90% of support conversations end-to-end, on par with human agents. Shipped production speech-to-speech LLM experiences, multi-agent orchestration across support channels, and pricing for enterprise SaaS. Deep hands-on background in Generative AI / LLM workflows, A/B testing, experimentation, and taking technical products from conception to launch.</w:t>
       </w:r>
     </w:p>
     <w:p>
@@ -207,7 +207,25 @@
           <w:sz w:val="20"/>
           <w:szCs w:val="20"/>
         </w:rPr>
-        <w:t xml:space="preserve">Own Sendbird's conversational AI agent product for customer support end-to-end as the sole voice PM, partnering with 8 engineers; built the product and team capabilities from scratch to 5 live enterprise customers — sustaining AI resolution rates on par with human support agents — with 4 active prospects in pipeline.</w:t>
+        <w:t xml:space="preserve">Own Sendbird's conversational AI agent product for customer support end-to-end as the sole voice PM, partnering with 8 engineers; built the product and team capabilities from scratch to 5 live enterprise customers with 4 active prospects in pipeline.</w:t>
+      </w:r>
+    </w:p>
+    <w:p>
+      <w:pPr>
+        <w:pStyle w:val="ListParagraph"/>
+        <w:numPr>
+          <w:ilvl w:val="0"/>
+          <w:numId w:val="2"/>
+        </w:numPr>
+        <w:spacing w:after="20" w:line="240"/>
+      </w:pPr>
+      <w:r>
+        <w:rPr>
+          <w:rFonts w:ascii="Calibri" w:cs="Calibri" w:eastAsia="Calibri" w:hAnsi="Calibri"/>
+          <w:sz w:val="20"/>
+          <w:szCs w:val="20"/>
+        </w:rPr>
+        <w:t xml:space="preserve">Sustained 80–90% AI resolution rates — on par with human support agents — while scaling toward deployments of ~9M support calls per year across Korea and Japan (4,000–5,000 concurrent calls); gated every release on a 100%-pass automated conversation-QA suite.</w:t>
       </w:r>
     </w:p>
     <w:p>

</xml_diff>